<commit_message>
feat: add professional CV documents and sitemap
</commit_message>
<xml_diff>
--- a/public/cv/Oladiti Adewale John CV Technical Product Operations 2026.docx
+++ b/public/cv/Oladiti Adewale John CV Technical Product Operations 2026.docx
@@ -37,6 +37,12 @@
     <w:p>
       <w:pPr>
         <w:spacing w:after="40"/>
+        <w:rPr>
+          <w:rFonts w:ascii="Calibri" w:eastAsia="Calibri" w:hAnsi="Calibri" w:cs="Calibri"/>
+          <w:color w:val="555555"/>
+          <w:sz w:val="18"/>
+          <w:szCs w:val="18"/>
+        </w:rPr>
       </w:pPr>
       <w:r>
         <w:rPr>
@@ -66,6 +72,19 @@
         </w:rPr>
         <w:t xml:space="preserve">LinkedIn: </w:t>
       </w:r>
+      <w:hyperlink r:id="rId5" w:history="1">
+        <w:r>
+          <w:rPr>
+            <w:rStyle w:val="Hyperlink"/>
+            <w:rFonts w:ascii="Calibri" w:eastAsia="Calibri" w:hAnsi="Calibri" w:cs="Calibri"/>
+            <w:i/>
+            <w:iCs/>
+            <w:sz w:val="18"/>
+            <w:szCs w:val="18"/>
+          </w:rPr>
+          <w:t>Click to open</w:t>
+        </w:r>
+      </w:hyperlink>
       <w:r>
         <w:rPr>
           <w:rFonts w:ascii="Calibri" w:eastAsia="Calibri" w:hAnsi="Calibri" w:cs="Calibri"/>
@@ -75,8 +94,21 @@
           <w:sz w:val="18"/>
           <w:szCs w:val="18"/>
         </w:rPr>
-        <w:t>https://www.linkedin.com/in/adewale-oladiti-24207021a/</w:t>
-      </w:r>
+        <w:t xml:space="preserve">   |   GitHub: </w:t>
+      </w:r>
+      <w:hyperlink r:id="rId6" w:history="1">
+        <w:r>
+          <w:rPr>
+            <w:rStyle w:val="Hyperlink"/>
+            <w:rFonts w:ascii="Calibri" w:eastAsia="Calibri" w:hAnsi="Calibri" w:cs="Calibri"/>
+            <w:i/>
+            <w:iCs/>
+            <w:sz w:val="18"/>
+            <w:szCs w:val="18"/>
+          </w:rPr>
+          <w:t>Click to open</w:t>
+        </w:r>
+      </w:hyperlink>
       <w:r>
         <w:rPr>
           <w:rFonts w:ascii="Calibri" w:eastAsia="Calibri" w:hAnsi="Calibri" w:cs="Calibri"/>
@@ -86,32 +118,21 @@
           <w:sz w:val="18"/>
           <w:szCs w:val="18"/>
         </w:rPr>
-        <w:t xml:space="preserve">   |   GitHub: [add your </w:t>
-      </w:r>
-      <w:proofErr w:type="gramStart"/>
-      <w:r>
-        <w:rPr>
-          <w:rFonts w:ascii="Calibri" w:eastAsia="Calibri" w:hAnsi="Calibri" w:cs="Calibri"/>
-          <w:i/>
-          <w:iCs/>
-          <w:color w:val="555555"/>
-          <w:sz w:val="18"/>
-          <w:szCs w:val="18"/>
-        </w:rPr>
-        <w:t xml:space="preserve">URL]   </w:t>
-      </w:r>
-      <w:proofErr w:type="gramEnd"/>
-      <w:r>
-        <w:rPr>
-          <w:rFonts w:ascii="Calibri" w:eastAsia="Calibri" w:hAnsi="Calibri" w:cs="Calibri"/>
-          <w:i/>
-          <w:iCs/>
-          <w:color w:val="555555"/>
-          <w:sz w:val="18"/>
-          <w:szCs w:val="18"/>
-        </w:rPr>
-        <w:t>|   Portfolio: [add your URL, if available]</w:t>
-      </w:r>
+        <w:t xml:space="preserve">   |   Portfolio: </w:t>
+      </w:r>
+      <w:hyperlink r:id="rId7" w:history="1">
+        <w:r>
+          <w:rPr>
+            <w:rStyle w:val="Hyperlink"/>
+            <w:rFonts w:ascii="Calibri" w:eastAsia="Calibri" w:hAnsi="Calibri" w:cs="Calibri"/>
+            <w:i/>
+            <w:iCs/>
+            <w:sz w:val="18"/>
+            <w:szCs w:val="18"/>
+          </w:rPr>
+          <w:t>Click to open</w:t>
+        </w:r>
+      </w:hyperlink>
     </w:p>
     <w:p>
       <w:pPr>
@@ -373,21 +394,7 @@
         <w:rPr>
           <w:rFonts w:ascii="Calibri" w:eastAsia="Calibri" w:hAnsi="Calibri" w:cs="Calibri"/>
         </w:rPr>
-        <w:t xml:space="preserve">Administer role-based access control (RBAC) for four clinical user types — doctor, nurse, receptionist, and </w:t>
-      </w:r>
-      <w:proofErr w:type="gramStart"/>
-      <w:r>
-        <w:rPr>
-          <w:rFonts w:ascii="Calibri" w:eastAsia="Calibri" w:hAnsi="Calibri" w:cs="Calibri"/>
-        </w:rPr>
-        <w:t>patient —</w:t>
-      </w:r>
-      <w:proofErr w:type="gramEnd"/>
-      <w:r>
-        <w:rPr>
-          <w:rFonts w:ascii="Calibri" w:eastAsia="Calibri" w:hAnsi="Calibri" w:cs="Calibri"/>
-        </w:rPr>
-        <w:t xml:space="preserve"> managing platform access as an operational function.</w:t>
+        <w:t>Administer role-based access control (RBAC) for four clinical user types — doctor, nurse, receptionist, and patient — managing platform access as an operational function.</w:t>
       </w:r>
     </w:p>
     <w:p>
@@ -496,21 +503,7 @@
         <w:rPr>
           <w:rFonts w:ascii="Calibri" w:eastAsia="Calibri" w:hAnsi="Calibri" w:cs="Calibri"/>
         </w:rPr>
-        <w:t xml:space="preserve">Owned the technical deployment pipeline for a multi-organization LMS: containerized the application with Docker, built CI/CD via GitHub Actions, and </w:t>
-      </w:r>
-      <w:proofErr w:type="gramStart"/>
-      <w:r>
-        <w:rPr>
-          <w:rFonts w:ascii="Calibri" w:eastAsia="Calibri" w:hAnsi="Calibri" w:cs="Calibri"/>
-        </w:rPr>
-        <w:t>deployed</w:t>
-      </w:r>
-      <w:proofErr w:type="gramEnd"/>
-      <w:r>
-        <w:rPr>
-          <w:rFonts w:ascii="Calibri" w:eastAsia="Calibri" w:hAnsi="Calibri" w:cs="Calibri"/>
-        </w:rPr>
-        <w:t xml:space="preserve"> to AWS.</w:t>
+        <w:t>Owned the technical deployment pipeline for a multi-organization LMS: containerized the application with Docker, built CI/CD via GitHub Actions, and deployed to AWS.</w:t>
       </w:r>
     </w:p>
     <w:p>
@@ -558,35 +551,7 @@
         <w:rPr>
           <w:rFonts w:ascii="Calibri" w:eastAsia="Calibri" w:hAnsi="Calibri" w:cs="Calibri"/>
         </w:rPr>
-        <w:t xml:space="preserve">Configured multi-tenant access (organization-specific RBAC) </w:t>
-      </w:r>
-      <w:proofErr w:type="gramStart"/>
-      <w:r>
-        <w:rPr>
-          <w:rFonts w:ascii="Calibri" w:eastAsia="Calibri" w:hAnsi="Calibri" w:cs="Calibri"/>
-        </w:rPr>
-        <w:t>to operationally</w:t>
-      </w:r>
-      <w:proofErr w:type="gramEnd"/>
-      <w:r>
-        <w:rPr>
-          <w:rFonts w:ascii="Calibri" w:eastAsia="Calibri" w:hAnsi="Calibri" w:cs="Calibri"/>
-        </w:rPr>
-        <w:t xml:space="preserve"> </w:t>
-      </w:r>
-      <w:proofErr w:type="gramStart"/>
-      <w:r>
-        <w:rPr>
-          <w:rFonts w:ascii="Calibri" w:eastAsia="Calibri" w:hAnsi="Calibri" w:cs="Calibri"/>
-        </w:rPr>
-        <w:t>support</w:t>
-      </w:r>
-      <w:proofErr w:type="gramEnd"/>
-      <w:r>
-        <w:rPr>
-          <w:rFonts w:ascii="Calibri" w:eastAsia="Calibri" w:hAnsi="Calibri" w:cs="Calibri"/>
-        </w:rPr>
-        <w:t xml:space="preserve"> multiple client organizations on one platform.</w:t>
+        <w:t>Configured multi-tenant access (organization-specific RBAC) to operationally support multiple client organizations on one platform.</w:t>
       </w:r>
     </w:p>
     <w:p>
@@ -1125,21 +1090,7 @@
         <w:rPr>
           <w:rFonts w:ascii="Calibri" w:eastAsia="Calibri" w:hAnsi="Calibri" w:cs="Calibri"/>
         </w:rPr>
-        <w:t>Software Engineering Intern, First Technical University ICT Department (</w:t>
-      </w:r>
-      <w:proofErr w:type="gramStart"/>
-      <w:r>
-        <w:rPr>
-          <w:rFonts w:ascii="Calibri" w:eastAsia="Calibri" w:hAnsi="Calibri" w:cs="Calibri"/>
-        </w:rPr>
-        <w:t>2022) —</w:t>
-      </w:r>
-      <w:proofErr w:type="gramEnd"/>
-      <w:r>
-        <w:rPr>
-          <w:rFonts w:ascii="Calibri" w:eastAsia="Calibri" w:hAnsi="Calibri" w:cs="Calibri"/>
-        </w:rPr>
-        <w:t xml:space="preserve"> Contributed to debugging, feature development, and technical documentation under senior engineer supervision.</w:t>
+        <w:t>Software Engineering Intern, First Technical University ICT Department (2022) — Contributed to debugging, feature development, and technical documentation under senior engineer supervision.</w:t>
       </w:r>
     </w:p>
     <w:p>
@@ -1253,21 +1204,7 @@
         <w:rPr>
           <w:rFonts w:ascii="Calibri" w:eastAsia="Calibri" w:hAnsi="Calibri" w:cs="Calibri"/>
         </w:rPr>
-        <w:t xml:space="preserve">Google Developer Student Club — Web </w:t>
-      </w:r>
-      <w:proofErr w:type="gramStart"/>
-      <w:r>
-        <w:rPr>
-          <w:rFonts w:ascii="Calibri" w:eastAsia="Calibri" w:hAnsi="Calibri" w:cs="Calibri"/>
-        </w:rPr>
-        <w:t>Lead  ·</w:t>
-      </w:r>
-      <w:proofErr w:type="gramEnd"/>
-      <w:r>
-        <w:rPr>
-          <w:rFonts w:ascii="Calibri" w:eastAsia="Calibri" w:hAnsi="Calibri" w:cs="Calibri"/>
-        </w:rPr>
-        <w:t xml:space="preserve">  Nigeria Content Development and Monitoring Board (NCDMB) Certification</w:t>
+        <w:t>Google Developer Student Club — Web Lead  ·  Nigeria Content Development and Monitoring Board (NCDMB) Certification</w:t>
       </w:r>
     </w:p>
     <w:sectPr>

</xml_diff>